<commit_message>
Finalize 4B inference submission
</commit_message>
<xml_diff>
--- a/design/AI智能体设计方案.docx
+++ b/design/AI智能体设计方案.docx
@@ -218,7 +218,7 @@
           <w:color w:val="000000"/>
           <w:sz w:val="21"/>
         </w:rPr>
-        <w:t>智能体由数据准备、场景路由、视觉推理、低置信度复核、结构化校验和提交打包六个模块组成。基座模型为Qwen3-VL-2B-Instruct，采用BF16在本地GPU运行；推理阶段不访问网络。</w:t>
+        <w:t>智能体由数据准备、场景路由、视觉推理、低置信度复核、结构化校验和提交打包六个模块组成。基座模型为Qwen3-VL-4B-Instruct，采用BF16在本地GPU运行；推理阶段不访问网络。</w:t>
       </w:r>
     </w:p>
     <w:tbl>
@@ -917,7 +917,7 @@
           <w:color w:val="000000"/>
           <w:sz w:val="21"/>
         </w:rPr>
-        <w:t>分域视觉模块：六小时首版将桥梁整图最长边缩放到384像素；轨道整图保持448像素，并把四个重叠象限缩略图拼成一张2×2细节图。模型仍观察四个局部区域，但只编码两张图，兼顾细裂缝识别与吞吐。</w:t>
+        <w:t>分域视觉模块：最终配置将桥梁整图和四象限细节图送入4B模型，并在桥梁场景增加一次粗类别初筛；轨道使用整图和四象限细节图，兼顾细裂缝识别与吞吐。</w:t>
       </w:r>
     </w:p>
     <w:p>
@@ -945,7 +945,7 @@
           <w:color w:val="000000"/>
           <w:sz w:val="21"/>
         </w:rPr>
-        <w:t>自动复核模块：当轨道结果置信度低于0.65或完好标签与病害描述冲突时触发第二轮推理。六小时首版关闭桥梁二次复核，非法标签由训练集词典自动规范化，避免重复推理拖延完整提交。</w:t>
+        <w:t>自动复核模块：模型先生成桥梁粗类别，再由结构化病害提示词完成最终分类；轨道结果在低置信度或描述矛盾时触发复核。非法标签由训练集词典自动规范化，审核记录只作为聚合证据提示，不覆盖测试结果。</w:t>
       </w:r>
     </w:p>
     <w:p>
@@ -1530,7 +1530,7 @@
                 <w:color w:val="000000"/>
                 <w:sz w:val="17"/>
               </w:rPr>
-              <w:t>病害类型精确率</w:t>
+              <w:t>训练难例审核</w:t>
             </w:r>
           </w:p>
         </w:tc>
@@ -1559,7 +1559,7 @@
                 <w:color w:val="000000"/>
                 <w:sz w:val="17"/>
               </w:rPr>
-              <w:t>0.0417</w:t>
+              <w:t>48</w:t>
             </w:r>
           </w:p>
         </w:tc>
@@ -1588,7 +1588,7 @@
                 <w:color w:val="000000"/>
                 <w:sz w:val="17"/>
               </w:rPr>
-              <w:t>仅用于本地版本比较</w:t>
+              <w:t>已确认38，需复核10</w:t>
             </w:r>
           </w:p>
         </w:tc>
@@ -1618,63 +1618,63 @@
                 <w:color w:val="000000"/>
                 <w:sz w:val="17"/>
               </w:rPr>
-              <w:t>原子病害Macro-F1</w:t>
-            </w:r>
-          </w:p>
-        </w:tc>
-        <w:tc>
-          <w:tcPr>
-            <w:tcW w:type="dxa" w:w="2760"/>
-            <w:vAlign w:val="center"/>
-            <w:tcBorders>
-              <w:top w:val="single" w:sz="6" w:color="D9D9D9"/>
-              <w:left w:val="single" w:sz="6" w:color="D9D9D9"/>
-              <w:bottom w:val="single" w:sz="6" w:color="D9D9D9"/>
-              <w:right w:val="single" w:sz="6" w:color="D9D9D9"/>
-              <w:insideH w:val="single" w:sz="6" w:color="D9D9D9"/>
-              <w:insideV w:val="single" w:sz="6" w:color="D9D9D9"/>
-            </w:tcBorders>
-          </w:tcPr>
-          <w:p>
-            <w:pPr>
-              <w:spacing w:after="0" w:line="240" w:lineRule="auto"/>
-            </w:pPr>
-            <w:r>
-              <w:rPr>
-                <w:rFonts w:ascii="Arial" w:hAnsi="Arial" w:eastAsia="Arial"/>
-                <w:b w:val="0"/>
-                <w:color w:val="000000"/>
-                <w:sz w:val="17"/>
-              </w:rPr>
-              <w:t>0.0933</w:t>
-            </w:r>
-          </w:p>
-        </w:tc>
-        <w:tc>
-          <w:tcPr>
-            <w:tcW w:type="dxa" w:w="2760"/>
-            <w:vAlign w:val="center"/>
-            <w:tcBorders>
-              <w:top w:val="single" w:sz="6" w:color="D9D9D9"/>
-              <w:left w:val="single" w:sz="6" w:color="D9D9D9"/>
-              <w:bottom w:val="single" w:sz="6" w:color="D9D9D9"/>
-              <w:right w:val="single" w:sz="6" w:color="D9D9D9"/>
-              <w:insideH w:val="single" w:sz="6" w:color="D9D9D9"/>
-              <w:insideV w:val="single" w:sz="6" w:color="D9D9D9"/>
-            </w:tcBorders>
-          </w:tcPr>
-          <w:p>
-            <w:pPr>
-              <w:spacing w:after="0" w:line="240" w:lineRule="auto"/>
-            </w:pPr>
-            <w:r>
-              <w:rPr>
-                <w:rFonts w:ascii="Arial" w:hAnsi="Arial" w:eastAsia="Arial"/>
-                <w:b w:val="0"/>
-                <w:color w:val="000000"/>
-                <w:sz w:val="17"/>
-              </w:rPr>
-              <w:t>组合病害拆分后计算</w:t>
+              <w:t>病害类型精确率</w:t>
+            </w:r>
+          </w:p>
+        </w:tc>
+        <w:tc>
+          <w:tcPr>
+            <w:tcW w:type="dxa" w:w="2760"/>
+            <w:vAlign w:val="center"/>
+            <w:tcBorders>
+              <w:top w:val="single" w:sz="6" w:color="D9D9D9"/>
+              <w:left w:val="single" w:sz="6" w:color="D9D9D9"/>
+              <w:bottom w:val="single" w:sz="6" w:color="D9D9D9"/>
+              <w:right w:val="single" w:sz="6" w:color="D9D9D9"/>
+              <w:insideH w:val="single" w:sz="6" w:color="D9D9D9"/>
+              <w:insideV w:val="single" w:sz="6" w:color="D9D9D9"/>
+            </w:tcBorders>
+          </w:tcPr>
+          <w:p>
+            <w:pPr>
+              <w:spacing w:after="0" w:line="240" w:lineRule="auto"/>
+            </w:pPr>
+            <w:r>
+              <w:rPr>
+                <w:rFonts w:ascii="Arial" w:hAnsi="Arial" w:eastAsia="Arial"/>
+                <w:b w:val="0"/>
+                <w:color w:val="000000"/>
+                <w:sz w:val="17"/>
+              </w:rPr>
+              <w:t>0.0417</w:t>
+            </w:r>
+          </w:p>
+        </w:tc>
+        <w:tc>
+          <w:tcPr>
+            <w:tcW w:type="dxa" w:w="2760"/>
+            <w:vAlign w:val="center"/>
+            <w:tcBorders>
+              <w:top w:val="single" w:sz="6" w:color="D9D9D9"/>
+              <w:left w:val="single" w:sz="6" w:color="D9D9D9"/>
+              <w:bottom w:val="single" w:sz="6" w:color="D9D9D9"/>
+              <w:right w:val="single" w:sz="6" w:color="D9D9D9"/>
+              <w:insideH w:val="single" w:sz="6" w:color="D9D9D9"/>
+              <w:insideV w:val="single" w:sz="6" w:color="D9D9D9"/>
+            </w:tcBorders>
+          </w:tcPr>
+          <w:p>
+            <w:pPr>
+              <w:spacing w:after="0" w:line="240" w:lineRule="auto"/>
+            </w:pPr>
+            <w:r>
+              <w:rPr>
+                <w:rFonts w:ascii="Arial" w:hAnsi="Arial" w:eastAsia="Arial"/>
+                <w:b w:val="0"/>
+                <w:color w:val="000000"/>
+                <w:sz w:val="17"/>
+              </w:rPr>
+              <w:t>仅用于本地版本比较</w:t>
             </w:r>
           </w:p>
         </w:tc>
@@ -1705,7 +1705,7 @@
                 <w:color w:val="000000"/>
                 <w:sz w:val="17"/>
               </w:rPr>
-              <w:t>评定标度准确率</w:t>
+              <w:t>原子病害Macro-F1</w:t>
             </w:r>
           </w:p>
         </w:tc>
@@ -1734,7 +1734,7 @@
                 <w:color w:val="000000"/>
                 <w:sz w:val="17"/>
               </w:rPr>
-              <w:t>0.7917</w:t>
+              <w:t>0.0494</w:t>
             </w:r>
           </w:p>
         </w:tc>
@@ -1763,7 +1763,7 @@
                 <w:color w:val="000000"/>
                 <w:sz w:val="17"/>
               </w:rPr>
-              <w:t>含空标度</w:t>
+              <w:t>组合病害拆分后计算</w:t>
             </w:r>
           </w:p>
         </w:tc>
@@ -1793,6 +1793,93 @@
                 <w:color w:val="000000"/>
                 <w:sz w:val="17"/>
               </w:rPr>
+              <w:t>评定标度准确率</w:t>
+            </w:r>
+          </w:p>
+        </w:tc>
+        <w:tc>
+          <w:tcPr>
+            <w:tcW w:type="dxa" w:w="2760"/>
+            <w:vAlign w:val="center"/>
+            <w:tcBorders>
+              <w:top w:val="single" w:sz="6" w:color="D9D9D9"/>
+              <w:left w:val="single" w:sz="6" w:color="D9D9D9"/>
+              <w:bottom w:val="single" w:sz="6" w:color="D9D9D9"/>
+              <w:right w:val="single" w:sz="6" w:color="D9D9D9"/>
+              <w:insideH w:val="single" w:sz="6" w:color="D9D9D9"/>
+              <w:insideV w:val="single" w:sz="6" w:color="D9D9D9"/>
+            </w:tcBorders>
+          </w:tcPr>
+          <w:p>
+            <w:pPr>
+              <w:spacing w:after="0" w:line="240" w:lineRule="auto"/>
+            </w:pPr>
+            <w:r>
+              <w:rPr>
+                <w:rFonts w:ascii="Arial" w:hAnsi="Arial" w:eastAsia="Arial"/>
+                <w:b w:val="0"/>
+                <w:color w:val="000000"/>
+                <w:sz w:val="17"/>
+              </w:rPr>
+              <w:t>0.4583</w:t>
+            </w:r>
+          </w:p>
+        </w:tc>
+        <w:tc>
+          <w:tcPr>
+            <w:tcW w:type="dxa" w:w="2760"/>
+            <w:vAlign w:val="center"/>
+            <w:tcBorders>
+              <w:top w:val="single" w:sz="6" w:color="D9D9D9"/>
+              <w:left w:val="single" w:sz="6" w:color="D9D9D9"/>
+              <w:bottom w:val="single" w:sz="6" w:color="D9D9D9"/>
+              <w:right w:val="single" w:sz="6" w:color="D9D9D9"/>
+              <w:insideH w:val="single" w:sz="6" w:color="D9D9D9"/>
+              <w:insideV w:val="single" w:sz="6" w:color="D9D9D9"/>
+            </w:tcBorders>
+          </w:tcPr>
+          <w:p>
+            <w:pPr>
+              <w:spacing w:after="0" w:line="240" w:lineRule="auto"/>
+            </w:pPr>
+            <w:r>
+              <w:rPr>
+                <w:rFonts w:ascii="Arial" w:hAnsi="Arial" w:eastAsia="Arial"/>
+                <w:b w:val="0"/>
+                <w:color w:val="000000"/>
+                <w:sz w:val="17"/>
+              </w:rPr>
+              <w:t>含空标度</w:t>
+            </w:r>
+          </w:p>
+        </w:tc>
+      </w:tr>
+      <w:tr>
+        <w:tc>
+          <w:tcPr>
+            <w:tcW w:type="dxa" w:w="2760"/>
+            <w:vAlign w:val="center"/>
+            <w:tcBorders>
+              <w:top w:val="single" w:sz="6" w:color="D9D9D9"/>
+              <w:left w:val="single" w:sz="6" w:color="D9D9D9"/>
+              <w:bottom w:val="single" w:sz="6" w:color="D9D9D9"/>
+              <w:right w:val="single" w:sz="6" w:color="D9D9D9"/>
+              <w:insideH w:val="single" w:sz="6" w:color="D9D9D9"/>
+              <w:insideV w:val="single" w:sz="6" w:color="D9D9D9"/>
+            </w:tcBorders>
+            <w:shd w:fill="F4F7FA"/>
+          </w:tcPr>
+          <w:p>
+            <w:pPr>
+              <w:spacing w:after="0" w:line="240" w:lineRule="auto"/>
+            </w:pPr>
+            <w:r>
+              <w:rPr>
+                <w:rFonts w:ascii="Arial" w:hAnsi="Arial" w:eastAsia="Arial"/>
+                <w:b w:val="0"/>
+                <w:color w:val="000000"/>
+                <w:sz w:val="17"/>
+              </w:rPr>
               <w:t>结果文件校验</w:t>
             </w:r>
           </w:p>
@@ -1809,6 +1896,7 @@
               <w:insideH w:val="single" w:sz="6" w:color="D9D9D9"/>
               <w:insideV w:val="single" w:sz="6" w:color="D9D9D9"/>
             </w:tcBorders>
+            <w:shd w:fill="F4F7FA"/>
           </w:tcPr>
           <w:p>
             <w:pPr>
@@ -1837,6 +1925,7 @@
               <w:insideH w:val="single" w:sz="6" w:color="D9D9D9"/>
               <w:insideV w:val="single" w:sz="6" w:color="D9D9D9"/>
             </w:tcBorders>
+            <w:shd w:fill="F4F7FA"/>
           </w:tcPr>
           <w:p>
             <w:pPr>
@@ -2136,7 +2225,7 @@
                 <w:color w:val="000000"/>
                 <w:sz w:val="17"/>
               </w:rPr>
-              <w:t>1.71小时</w:t>
+              <w:t>1.47小时</w:t>
             </w:r>
           </w:p>
         </w:tc>
@@ -2223,7 +2312,7 @@
                 <w:color w:val="000000"/>
                 <w:sz w:val="17"/>
               </w:rPr>
-              <w:t>0.20641张/秒</w:t>
+              <w:t>0.24133张/秒</w:t>
             </w:r>
           </w:p>
         </w:tc>

</xml_diff>

<commit_message>
Upgrade result with visual candidate review
</commit_message>
<xml_diff>
--- a/design/AI智能体设计方案.docx
+++ b/design/AI智能体设计方案.docx
@@ -641,7 +641,7 @@
                 <w:color w:val="000000"/>
                 <w:sz w:val="17"/>
               </w:rPr>
-              <w:t>轨道低置信度结果</w:t>
+              <w:t>局部复核与视觉候选</w:t>
             </w:r>
           </w:p>
         </w:tc>
@@ -670,7 +670,7 @@
                 <w:color w:val="000000"/>
                 <w:sz w:val="17"/>
               </w:rPr>
-              <w:t>使用整图和四象限细节拼图再次推理</w:t>
+              <w:t>Qwen复核视觉头候选并保留原始响应</w:t>
             </w:r>
           </w:p>
         </w:tc>
@@ -945,7 +945,7 @@
           <w:color w:val="000000"/>
           <w:sz w:val="21"/>
         </w:rPr>
-        <w:t>自动复核模块：模型先生成桥梁粗类别，再由结构化病害提示词完成最终分类；轨道结果在低置信度或描述矛盾时触发复核。非法标签由训练集词典自动规范化，审核记录只作为聚合证据提示，不覆盖测试结果。</w:t>
+        <w:t>自动复核模块：模型先生成桥梁粗类别，再由结构化病害提示词完成最终分类；支座、梁底和轨道的视觉候选逐项交给本地Qwen重新生成描述，只有合法标签与视觉候选一致时才接受。非法标签由训练集词典自动规范化，审核记录只作为聚合证据提示，不覆盖测试结果。</w:t>
       </w:r>
     </w:p>
     <w:p>
@@ -1058,7 +1058,21 @@
           <w:color w:val="000000"/>
           <w:sz w:val="21"/>
         </w:rPr>
-        <w:t>4. 全流程可追溯：保存模型版本、固定种子、每张图片原始响应、断点和校验报告，便于赛事复核和决赛演示。</w:t>
+        <w:t>4. 双模型候选确认：冻结视觉头负责跨场景标签候选，Qwen负责同图证据描述；每个改变项保留候选分数、原始响应和接受状态。</w:t>
+      </w:r>
+    </w:p>
+    <w:p>
+      <w:pPr>
+        <w:spacing w:after="120" w:line="312" w:lineRule="auto"/>
+      </w:pPr>
+      <w:r>
+        <w:rPr>
+          <w:rFonts w:ascii="Arial" w:hAnsi="Arial" w:eastAsia="Arial"/>
+          <w:b w:val="0"/>
+          <w:color w:val="000000"/>
+          <w:sz w:val="21"/>
+        </w:rPr>
+        <w:t>5. 全流程可追溯：保存模型版本、固定种子、每张图片原始响应、断点和校验报告，便于赛事复核和决赛演示。</w:t>
       </w:r>
     </w:p>
     <w:p>
@@ -1939,6 +1953,92 @@
                 <w:sz w:val="17"/>
               </w:rPr>
               <w:t>七字段、数量及标签合法性</w:t>
+            </w:r>
+          </w:p>
+        </w:tc>
+      </w:tr>
+      <w:tr>
+        <w:tc>
+          <w:tcPr>
+            <w:tcW w:type="dxa" w:w="2760"/>
+            <w:vAlign w:val="center"/>
+            <w:tcBorders>
+              <w:top w:val="single" w:sz="6" w:color="D9D9D9"/>
+              <w:left w:val="single" w:sz="6" w:color="D9D9D9"/>
+              <w:bottom w:val="single" w:sz="6" w:color="D9D9D9"/>
+              <w:right w:val="single" w:sz="6" w:color="D9D9D9"/>
+              <w:insideH w:val="single" w:sz="6" w:color="D9D9D9"/>
+              <w:insideV w:val="single" w:sz="6" w:color="D9D9D9"/>
+            </w:tcBorders>
+          </w:tcPr>
+          <w:p>
+            <w:pPr>
+              <w:spacing w:after="0" w:line="240" w:lineRule="auto"/>
+            </w:pPr>
+            <w:r>
+              <w:rPr>
+                <w:rFonts w:ascii="Arial" w:hAnsi="Arial" w:eastAsia="Arial"/>
+                <w:b w:val="0"/>
+                <w:color w:val="000000"/>
+                <w:sz w:val="17"/>
+              </w:rPr>
+              <w:t>视觉候选复核</w:t>
+            </w:r>
+          </w:p>
+        </w:tc>
+        <w:tc>
+          <w:tcPr>
+            <w:tcW w:type="dxa" w:w="2760"/>
+            <w:vAlign w:val="center"/>
+            <w:tcBorders>
+              <w:top w:val="single" w:sz="6" w:color="D9D9D9"/>
+              <w:left w:val="single" w:sz="6" w:color="D9D9D9"/>
+              <w:bottom w:val="single" w:sz="6" w:color="D9D9D9"/>
+              <w:right w:val="single" w:sz="6" w:color="D9D9D9"/>
+              <w:insideH w:val="single" w:sz="6" w:color="D9D9D9"/>
+              <w:insideV w:val="single" w:sz="6" w:color="D9D9D9"/>
+            </w:tcBorders>
+          </w:tcPr>
+          <w:p>
+            <w:pPr>
+              <w:spacing w:after="0" w:line="240" w:lineRule="auto"/>
+            </w:pPr>
+            <w:r>
+              <w:rPr>
+                <w:rFonts w:ascii="Arial" w:hAnsi="Arial" w:eastAsia="Arial"/>
+                <w:b w:val="0"/>
+                <w:color w:val="000000"/>
+                <w:sz w:val="17"/>
+              </w:rPr>
+              <w:t>319</w:t>
+            </w:r>
+          </w:p>
+        </w:tc>
+        <w:tc>
+          <w:tcPr>
+            <w:tcW w:type="dxa" w:w="2760"/>
+            <w:vAlign w:val="center"/>
+            <w:tcBorders>
+              <w:top w:val="single" w:sz="6" w:color="D9D9D9"/>
+              <w:left w:val="single" w:sz="6" w:color="D9D9D9"/>
+              <w:bottom w:val="single" w:sz="6" w:color="D9D9D9"/>
+              <w:right w:val="single" w:sz="6" w:color="D9D9D9"/>
+              <w:insideH w:val="single" w:sz="6" w:color="D9D9D9"/>
+              <w:insideV w:val="single" w:sz="6" w:color="D9D9D9"/>
+            </w:tcBorders>
+          </w:tcPr>
+          <w:p>
+            <w:pPr>
+              <w:spacing w:after="0" w:line="240" w:lineRule="auto"/>
+            </w:pPr>
+            <w:r>
+              <w:rPr>
+                <w:rFonts w:ascii="Arial" w:hAnsi="Arial" w:eastAsia="Arial"/>
+                <w:b w:val="0"/>
+                <w:color w:val="000000"/>
+                <w:sz w:val="17"/>
+              </w:rPr>
+              <w:t>候选331项，逐项保存Qwen响应</w:t>
             </w:r>
           </w:p>
         </w:tc>

</xml_diff>

<commit_message>
Reject contradictory visual candidate evidence
</commit_message>
<xml_diff>
--- a/design/AI智能体设计方案.docx
+++ b/design/AI智能体设计方案.docx
@@ -945,7 +945,7 @@
           <w:color w:val="000000"/>
           <w:sz w:val="21"/>
         </w:rPr>
-        <w:t>自动复核模块：模型先生成桥梁粗类别，再由结构化病害提示词完成最终分类；支座、梁底和轨道的视觉候选逐项交给本地Qwen重新生成描述，只有合法标签与视觉候选一致时才接受。非法标签由训练集词典自动规范化，审核记录只作为聚合证据提示，不覆盖测试结果。</w:t>
+        <w:t>自动复核模块：模型先生成桥梁粗类别，再由结构化病害提示词完成最终分类；支座、梁底和轨道的视觉候选逐项交给本地Qwen重新生成描述，只有合法标签与视觉候选一致且证据没有明确否定该标签时才接受。非法标签由训练集词典自动规范化，审核记录只作为聚合证据提示，不覆盖测试结果。</w:t>
       </w:r>
     </w:p>
     <w:p>
@@ -2010,35 +2010,35 @@
                 <w:color w:val="000000"/>
                 <w:sz w:val="17"/>
               </w:rPr>
-              <w:t>319</w:t>
-            </w:r>
-          </w:p>
-        </w:tc>
-        <w:tc>
-          <w:tcPr>
-            <w:tcW w:type="dxa" w:w="2760"/>
-            <w:vAlign w:val="center"/>
-            <w:tcBorders>
-              <w:top w:val="single" w:sz="6" w:color="D9D9D9"/>
-              <w:left w:val="single" w:sz="6" w:color="D9D9D9"/>
-              <w:bottom w:val="single" w:sz="6" w:color="D9D9D9"/>
-              <w:right w:val="single" w:sz="6" w:color="D9D9D9"/>
-              <w:insideH w:val="single" w:sz="6" w:color="D9D9D9"/>
-              <w:insideV w:val="single" w:sz="6" w:color="D9D9D9"/>
-            </w:tcBorders>
-          </w:tcPr>
-          <w:p>
-            <w:pPr>
-              <w:spacing w:after="0" w:line="240" w:lineRule="auto"/>
-            </w:pPr>
-            <w:r>
-              <w:rPr>
-                <w:rFonts w:ascii="Arial" w:hAnsi="Arial" w:eastAsia="Arial"/>
-                <w:b w:val="0"/>
-                <w:color w:val="000000"/>
-                <w:sz w:val="17"/>
-              </w:rPr>
-              <w:t>候选331项，逐项保存Qwen响应</w:t>
+              <w:t>305</w:t>
+            </w:r>
+          </w:p>
+        </w:tc>
+        <w:tc>
+          <w:tcPr>
+            <w:tcW w:type="dxa" w:w="2760"/>
+            <w:vAlign w:val="center"/>
+            <w:tcBorders>
+              <w:top w:val="single" w:sz="6" w:color="D9D9D9"/>
+              <w:left w:val="single" w:sz="6" w:color="D9D9D9"/>
+              <w:bottom w:val="single" w:sz="6" w:color="D9D9D9"/>
+              <w:right w:val="single" w:sz="6" w:color="D9D9D9"/>
+              <w:insideH w:val="single" w:sz="6" w:color="D9D9D9"/>
+              <w:insideV w:val="single" w:sz="6" w:color="D9D9D9"/>
+            </w:tcBorders>
+          </w:tcPr>
+          <w:p>
+            <w:pPr>
+              <w:spacing w:after="0" w:line="240" w:lineRule="auto"/>
+            </w:pPr>
+            <w:r>
+              <w:rPr>
+                <w:rFonts w:ascii="Arial" w:hAnsi="Arial" w:eastAsia="Arial"/>
+                <w:b w:val="0"/>
+                <w:color w:val="000000"/>
+                <w:sz w:val="17"/>
+              </w:rPr>
+              <w:t>候选331项，矛盾证据自动回退14项</w:t>
             </w:r>
           </w:p>
         </w:tc>

</xml_diff>

<commit_message>
Restore scored baseline and harden candidate review
</commit_message>
<xml_diff>
--- a/design/AI智能体设计方案.docx
+++ b/design/AI智能体设计方案.docx
@@ -42,7 +42,7 @@
           <w:color w:val="000000"/>
           <w:sz w:val="21"/>
         </w:rPr>
-        <w:t>参赛队伍：_________</w:t>
+        <w:t>参赛队伍：想一个重庆人</w:t>
       </w:r>
     </w:p>
     <w:p>
@@ -945,7 +945,7 @@
           <w:color w:val="000000"/>
           <w:sz w:val="21"/>
         </w:rPr>
-        <w:t>自动复核模块：模型先生成桥梁粗类别，再由结构化病害提示词完成最终分类；支座、梁底和轨道的视觉候选逐项交给本地Qwen重新生成描述，只有合法标签与视觉候选一致且证据没有明确否定该标签时才接受。非法标签由训练集词典自动规范化，审核记录只作为聚合证据提示，不覆盖测试结果。</w:t>
+        <w:t>自动复核模块：模型先生成桥梁粗类别，再由结构化病害提示词完成最终分类。冻结视觉头候选和本地Qwen独立复核只用于runs目录中的隔离实验；候选标签不会写入正式测试结果，非法标签由训练集词典自动规范化。</w:t>
       </w:r>
     </w:p>
     <w:p>
@@ -1058,7 +1058,7 @@
           <w:color w:val="000000"/>
           <w:sz w:val="21"/>
         </w:rPr>
-        <w:t>4. 双模型候选确认：冻结视觉头负责跨场景标签候选，Qwen负责同图证据描述；每个改变项保留候选分数、原始响应和接受状态。</w:t>
+        <w:t>4. 候选流程隔离：冻结视觉头和Qwen复核只写入runs实验目录；未经与最终提交相同的成对留出验证，不改变正式测试结果。</w:t>
       </w:r>
     </w:p>
     <w:p>
@@ -1982,63 +1982,63 @@
                 <w:color w:val="000000"/>
                 <w:sz w:val="17"/>
               </w:rPr>
-              <w:t>视觉候选复核</w:t>
-            </w:r>
-          </w:p>
-        </w:tc>
-        <w:tc>
-          <w:tcPr>
-            <w:tcW w:type="dxa" w:w="2760"/>
-            <w:vAlign w:val="center"/>
-            <w:tcBorders>
-              <w:top w:val="single" w:sz="6" w:color="D9D9D9"/>
-              <w:left w:val="single" w:sz="6" w:color="D9D9D9"/>
-              <w:bottom w:val="single" w:sz="6" w:color="D9D9D9"/>
-              <w:right w:val="single" w:sz="6" w:color="D9D9D9"/>
-              <w:insideH w:val="single" w:sz="6" w:color="D9D9D9"/>
-              <w:insideV w:val="single" w:sz="6" w:color="D9D9D9"/>
-            </w:tcBorders>
-          </w:tcPr>
-          <w:p>
-            <w:pPr>
-              <w:spacing w:after="0" w:line="240" w:lineRule="auto"/>
-            </w:pPr>
-            <w:r>
-              <w:rPr>
-                <w:rFonts w:ascii="Arial" w:hAnsi="Arial" w:eastAsia="Arial"/>
-                <w:b w:val="0"/>
-                <w:color w:val="000000"/>
-                <w:sz w:val="17"/>
-              </w:rPr>
-              <w:t>305</w:t>
-            </w:r>
-          </w:p>
-        </w:tc>
-        <w:tc>
-          <w:tcPr>
-            <w:tcW w:type="dxa" w:w="2760"/>
-            <w:vAlign w:val="center"/>
-            <w:tcBorders>
-              <w:top w:val="single" w:sz="6" w:color="D9D9D9"/>
-              <w:left w:val="single" w:sz="6" w:color="D9D9D9"/>
-              <w:bottom w:val="single" w:sz="6" w:color="D9D9D9"/>
-              <w:right w:val="single" w:sz="6" w:color="D9D9D9"/>
-              <w:insideH w:val="single" w:sz="6" w:color="D9D9D9"/>
-              <w:insideV w:val="single" w:sz="6" w:color="D9D9D9"/>
-            </w:tcBorders>
-          </w:tcPr>
-          <w:p>
-            <w:pPr>
-              <w:spacing w:after="0" w:line="240" w:lineRule="auto"/>
-            </w:pPr>
-            <w:r>
-              <w:rPr>
-                <w:rFonts w:ascii="Arial" w:hAnsi="Arial" w:eastAsia="Arial"/>
-                <w:b w:val="0"/>
-                <w:color w:val="000000"/>
-                <w:sz w:val="17"/>
-              </w:rPr>
-              <w:t>候选331项，矛盾证据自动回退14项</w:t>
+              <w:t>正式结果候选改动</w:t>
+            </w:r>
+          </w:p>
+        </w:tc>
+        <w:tc>
+          <w:tcPr>
+            <w:tcW w:type="dxa" w:w="2760"/>
+            <w:vAlign w:val="center"/>
+            <w:tcBorders>
+              <w:top w:val="single" w:sz="6" w:color="D9D9D9"/>
+              <w:left w:val="single" w:sz="6" w:color="D9D9D9"/>
+              <w:bottom w:val="single" w:sz="6" w:color="D9D9D9"/>
+              <w:right w:val="single" w:sz="6" w:color="D9D9D9"/>
+              <w:insideH w:val="single" w:sz="6" w:color="D9D9D9"/>
+              <w:insideV w:val="single" w:sz="6" w:color="D9D9D9"/>
+            </w:tcBorders>
+          </w:tcPr>
+          <w:p>
+            <w:pPr>
+              <w:spacing w:after="0" w:line="240" w:lineRule="auto"/>
+            </w:pPr>
+            <w:r>
+              <w:rPr>
+                <w:rFonts w:ascii="Arial" w:hAnsi="Arial" w:eastAsia="Arial"/>
+                <w:b w:val="0"/>
+                <w:color w:val="000000"/>
+                <w:sz w:val="17"/>
+              </w:rPr>
+              <w:t>0</w:t>
+            </w:r>
+          </w:p>
+        </w:tc>
+        <w:tc>
+          <w:tcPr>
+            <w:tcW w:type="dxa" w:w="2760"/>
+            <w:vAlign w:val="center"/>
+            <w:tcBorders>
+              <w:top w:val="single" w:sz="6" w:color="D9D9D9"/>
+              <w:left w:val="single" w:sz="6" w:color="D9D9D9"/>
+              <w:bottom w:val="single" w:sz="6" w:color="D9D9D9"/>
+              <w:right w:val="single" w:sz="6" w:color="D9D9D9"/>
+              <w:insideH w:val="single" w:sz="6" w:color="D9D9D9"/>
+              <w:insideV w:val="single" w:sz="6" w:color="D9D9D9"/>
+            </w:tcBorders>
+          </w:tcPr>
+          <w:p>
+            <w:pPr>
+              <w:spacing w:after="0" w:line="240" w:lineRule="auto"/>
+            </w:pPr>
+            <w:r>
+              <w:rPr>
+                <w:rFonts w:ascii="Arial" w:hAnsi="Arial" w:eastAsia="Arial"/>
+                <w:b w:val="0"/>
+                <w:color w:val="000000"/>
+                <w:sz w:val="17"/>
+              </w:rPr>
+              <w:t>候选流程withdrawn; not included in result</w:t>
             </w:r>
           </w:p>
         </w:tc>

</xml_diff>

<commit_message>
Verify and atomically publish the track-four submission package
</commit_message>
<xml_diff>
--- a/design/AI智能体设计方案.docx
+++ b/design/AI智能体设计方案.docx
@@ -78,7 +78,7 @@
           <w:color w:val="000000"/>
           <w:sz w:val="21"/>
         </w:rPr>
-        <w:t>完成日期：2026年10月05日</w:t>
+        <w:t>完成日期：2026年10月12日</w:t>
       </w:r>
     </w:p>
     <w:p>
@@ -553,7 +553,7 @@
                 <w:color w:val="000000"/>
                 <w:sz w:val="17"/>
               </w:rPr>
-              <w:t>桥梁整图或轨道整图加细节拼图</w:t>
+              <w:t>航拍整图；近景整图加细节拼图</w:t>
             </w:r>
           </w:p>
         </w:tc>
@@ -670,7 +670,7 @@
                 <w:color w:val="000000"/>
                 <w:sz w:val="17"/>
               </w:rPr>
-              <w:t>Qwen复核视觉头候选并保留原始响应</w:t>
+              <w:t>可选模型复核；视觉候选仅限隔离实验</w:t>
             </w:r>
           </w:p>
         </w:tc>
@@ -917,7 +917,7 @@
           <w:color w:val="000000"/>
           <w:sz w:val="21"/>
         </w:rPr>
-        <w:t>分域视觉模块：最终配置将桥梁整图和四象限细节图送入4B模型，并在桥梁场景增加一次粗类别初筛；轨道使用整图和四象限细节图，兼顾细裂缝识别与吞吐。</w:t>
+        <w:t>分域视觉模块：桥梁航拍使用整图，支座及梁底近景使用整图和四象限细节拼图；桥梁增加一次粗类别初筛。轨道使用整图和四象限细节拼图。基座为本地Qwen3-VL-4B-Instruct，模型生成与数据后处理均保留日志。</w:t>
       </w:r>
     </w:p>
     <w:p>
@@ -959,7 +959,7 @@
           <w:color w:val="000000"/>
           <w:sz w:val="21"/>
         </w:rPr>
-        <w:t>工程可靠性模块：每25张图片持久化一次断点，推理中断后可继续运行；原始模型响应保存在日志中。最终校验测试图片数量、文件名多重集合、字段顺序、合法标签和标度范围。</w:t>
+        <w:t>工程可靠性模块：正式推理每25张图片保存断点，并保留原始模型响应。校验七个字符串字段、输入元数据、UTF-8编码、合法标签及重复项。打包先生成临时压缩包，逐文件读回核对SHA-256，再原子替换唯一提交包；失败时保留上一份包。</w:t>
       </w:r>
     </w:p>
     <w:p>
@@ -1016,7 +1016,7 @@
           <w:color w:val="000000"/>
           <w:sz w:val="21"/>
         </w:rPr>
-        <w:t>1. 基于数据域的自适应视觉输入：桥梁采用轻量整图，轨道采用整图加四象限拼图，同一模型按场景切换视觉预算。</w:t>
+        <w:t>1. 基于数据域的自适应视觉输入：桥梁航拍使用整图，支座和梁底近景、轨道使用整图加四象限细节拼图，同一模型按场景切换视觉预算。</w:t>
       </w:r>
     </w:p>
     <w:p>
@@ -1044,7 +1044,7 @@
           <w:color w:val="000000"/>
           <w:sz w:val="21"/>
         </w:rPr>
-        <w:t>3. 证据一致性复核：模型不仅给出类别，还给出可见依据；系统检测类别与描述冲突并自动复核，提高结构化结果可信度。</w:t>
+        <w:t>3. 证据一致性检查：保留类别、描述和可见依据，用于发现矛盾及触发可选复核。历史正式结果没有普通第二轮复核；扩展复核策略仍须通过隔离留出评估，不据此宣称准确率提高。</w:t>
       </w:r>
     </w:p>
     <w:p>
@@ -1151,6 +1151,20 @@
           <w:sz w:val="21"/>
         </w:rPr>
         <w:t>评估结果</w:t>
+      </w:r>
+    </w:p>
+    <w:p>
+      <w:pPr>
+        <w:spacing w:after="120" w:line="312" w:lineRule="auto"/>
+      </w:pPr>
+      <w:r>
+        <w:rPr>
+          <w:rFonts w:ascii="Arial" w:hAnsi="Arial" w:eastAsia="Arial"/>
+          <w:b w:val="0"/>
+          <w:color w:val="000000"/>
+          <w:sz w:val="21"/>
+        </w:rPr>
+        <w:t>提交版本说明：正式输出来自Git提交d2f6bde，保留历史官方反馈56.11分的完整模型结果；共1274条，没有人工逐图改写。53.06分视觉候选已撤回。本次工程检查不代表新官方成绩，标签范围扩展尚未完成两座整桥的配对验证，不替换正式输出。</w:t>
       </w:r>
     </w:p>
     <w:tbl>
@@ -1457,63 +1471,63 @@
                 <w:color w:val="000000"/>
                 <w:sz w:val="17"/>
               </w:rPr>
-              <w:t>校准样本</w:t>
-            </w:r>
-          </w:p>
-        </w:tc>
-        <w:tc>
-          <w:tcPr>
-            <w:tcW w:type="dxa" w:w="2760"/>
-            <w:vAlign w:val="center"/>
-            <w:tcBorders>
-              <w:top w:val="single" w:sz="6" w:color="D9D9D9"/>
-              <w:left w:val="single" w:sz="6" w:color="D9D9D9"/>
-              <w:bottom w:val="single" w:sz="6" w:color="D9D9D9"/>
-              <w:right w:val="single" w:sz="6" w:color="D9D9D9"/>
-              <w:insideH w:val="single" w:sz="6" w:color="D9D9D9"/>
-              <w:insideV w:val="single" w:sz="6" w:color="D9D9D9"/>
-            </w:tcBorders>
-          </w:tcPr>
-          <w:p>
-            <w:pPr>
-              <w:spacing w:after="0" w:line="240" w:lineRule="auto"/>
-            </w:pPr>
-            <w:r>
-              <w:rPr>
-                <w:rFonts w:ascii="Arial" w:hAnsi="Arial" w:eastAsia="Arial"/>
-                <w:b w:val="0"/>
-                <w:color w:val="000000"/>
-                <w:sz w:val="17"/>
-              </w:rPr>
-              <w:t>24</w:t>
-            </w:r>
-          </w:p>
-        </w:tc>
-        <w:tc>
-          <w:tcPr>
-            <w:tcW w:type="dxa" w:w="2760"/>
-            <w:vAlign w:val="center"/>
-            <w:tcBorders>
-              <w:top w:val="single" w:sz="6" w:color="D9D9D9"/>
-              <w:left w:val="single" w:sz="6" w:color="D9D9D9"/>
-              <w:bottom w:val="single" w:sz="6" w:color="D9D9D9"/>
-              <w:right w:val="single" w:sz="6" w:color="D9D9D9"/>
-              <w:insideH w:val="single" w:sz="6" w:color="D9D9D9"/>
-              <w:insideV w:val="single" w:sz="6" w:color="D9D9D9"/>
-            </w:tcBorders>
-          </w:tcPr>
-          <w:p>
-            <w:pPr>
-              <w:spacing w:after="0" w:line="240" w:lineRule="auto"/>
-            </w:pPr>
-            <w:r>
-              <w:rPr>
-                <w:rFonts w:ascii="Arial" w:hAnsi="Arial" w:eastAsia="Arial"/>
-                <w:b w:val="0"/>
-                <w:color w:val="000000"/>
-                <w:sz w:val="17"/>
-              </w:rPr>
-              <w:t>覆盖低频标签的压力抽样</w:t>
+              <w:t>留出样本</w:t>
+            </w:r>
+          </w:p>
+        </w:tc>
+        <w:tc>
+          <w:tcPr>
+            <w:tcW w:type="dxa" w:w="2760"/>
+            <w:vAlign w:val="center"/>
+            <w:tcBorders>
+              <w:top w:val="single" w:sz="6" w:color="D9D9D9"/>
+              <w:left w:val="single" w:sz="6" w:color="D9D9D9"/>
+              <w:bottom w:val="single" w:sz="6" w:color="D9D9D9"/>
+              <w:right w:val="single" w:sz="6" w:color="D9D9D9"/>
+              <w:insideH w:val="single" w:sz="6" w:color="D9D9D9"/>
+              <w:insideV w:val="single" w:sz="6" w:color="D9D9D9"/>
+            </w:tcBorders>
+          </w:tcPr>
+          <w:p>
+            <w:pPr>
+              <w:spacing w:after="0" w:line="240" w:lineRule="auto"/>
+            </w:pPr>
+            <w:r>
+              <w:rPr>
+                <w:rFonts w:ascii="Arial" w:hAnsi="Arial" w:eastAsia="Arial"/>
+                <w:b w:val="0"/>
+                <w:color w:val="000000"/>
+                <w:sz w:val="17"/>
+              </w:rPr>
+              <w:t>120</w:t>
+            </w:r>
+          </w:p>
+        </w:tc>
+        <w:tc>
+          <w:tcPr>
+            <w:tcW w:type="dxa" w:w="2760"/>
+            <w:vAlign w:val="center"/>
+            <w:tcBorders>
+              <w:top w:val="single" w:sz="6" w:color="D9D9D9"/>
+              <w:left w:val="single" w:sz="6" w:color="D9D9D9"/>
+              <w:bottom w:val="single" w:sz="6" w:color="D9D9D9"/>
+              <w:right w:val="single" w:sz="6" w:color="D9D9D9"/>
+              <w:insideH w:val="single" w:sz="6" w:color="D9D9D9"/>
+              <w:insideV w:val="single" w:sz="6" w:color="D9D9D9"/>
+            </w:tcBorders>
+          </w:tcPr>
+          <w:p>
+            <w:pPr>
+              <w:spacing w:after="0" w:line="240" w:lineRule="auto"/>
+            </w:pPr>
+            <w:r>
+              <w:rPr>
+                <w:rFonts w:ascii="Arial" w:hAnsi="Arial" w:eastAsia="Arial"/>
+                <w:b w:val="0"/>
+                <w:color w:val="000000"/>
+                <w:sz w:val="17"/>
+              </w:rPr>
+              <w:t>范家坪整桥单折基线，84桥梁、36轨道</w:t>
             </w:r>
           </w:p>
         </w:tc>
@@ -1660,35 +1674,35 @@
                 <w:color w:val="000000"/>
                 <w:sz w:val="17"/>
               </w:rPr>
-              <w:t>0.0417</w:t>
-            </w:r>
-          </w:p>
-        </w:tc>
-        <w:tc>
-          <w:tcPr>
-            <w:tcW w:type="dxa" w:w="2760"/>
-            <w:vAlign w:val="center"/>
-            <w:tcBorders>
-              <w:top w:val="single" w:sz="6" w:color="D9D9D9"/>
-              <w:left w:val="single" w:sz="6" w:color="D9D9D9"/>
-              <w:bottom w:val="single" w:sz="6" w:color="D9D9D9"/>
-              <w:right w:val="single" w:sz="6" w:color="D9D9D9"/>
-              <w:insideH w:val="single" w:sz="6" w:color="D9D9D9"/>
-              <w:insideV w:val="single" w:sz="6" w:color="D9D9D9"/>
-            </w:tcBorders>
-          </w:tcPr>
-          <w:p>
-            <w:pPr>
-              <w:spacing w:after="0" w:line="240" w:lineRule="auto"/>
-            </w:pPr>
-            <w:r>
-              <w:rPr>
-                <w:rFonts w:ascii="Arial" w:hAnsi="Arial" w:eastAsia="Arial"/>
-                <w:b w:val="0"/>
-                <w:color w:val="000000"/>
-                <w:sz w:val="17"/>
-              </w:rPr>
-              <w:t>仅用于本地版本比较</w:t>
+              <w:t>0.3167</w:t>
+            </w:r>
+          </w:p>
+        </w:tc>
+        <w:tc>
+          <w:tcPr>
+            <w:tcW w:type="dxa" w:w="2760"/>
+            <w:vAlign w:val="center"/>
+            <w:tcBorders>
+              <w:top w:val="single" w:sz="6" w:color="D9D9D9"/>
+              <w:left w:val="single" w:sz="6" w:color="D9D9D9"/>
+              <w:bottom w:val="single" w:sz="6" w:color="D9D9D9"/>
+              <w:right w:val="single" w:sz="6" w:color="D9D9D9"/>
+              <w:insideH w:val="single" w:sz="6" w:color="D9D9D9"/>
+              <w:insideV w:val="single" w:sz="6" w:color="D9D9D9"/>
+            </w:tcBorders>
+          </w:tcPr>
+          <w:p>
+            <w:pPr>
+              <w:spacing w:after="0" w:line="240" w:lineRule="auto"/>
+            </w:pPr>
+            <w:r>
+              <w:rPr>
+                <w:rFonts w:ascii="Arial" w:hAnsi="Arial" w:eastAsia="Arial"/>
+                <w:b w:val="0"/>
+                <w:color w:val="000000"/>
+                <w:sz w:val="17"/>
+              </w:rPr>
+              <w:t>桥梁33/84；轨道5/36</w:t>
             </w:r>
           </w:p>
         </w:tc>
@@ -1748,7 +1762,7 @@
                 <w:color w:val="000000"/>
                 <w:sz w:val="17"/>
               </w:rPr>
-              <w:t>0.0494</w:t>
+              <w:t>0.2531</w:t>
             </w:r>
           </w:p>
         </w:tc>
@@ -1777,7 +1791,7 @@
                 <w:color w:val="000000"/>
                 <w:sz w:val="17"/>
               </w:rPr>
-              <w:t>组合病害拆分后计算</w:t>
+              <w:t>组合标签拆分；仅用于本地比较</w:t>
             </w:r>
           </w:p>
         </w:tc>
@@ -1835,35 +1849,35 @@
                 <w:color w:val="000000"/>
                 <w:sz w:val="17"/>
               </w:rPr>
-              <w:t>0.4583</w:t>
-            </w:r>
-          </w:p>
-        </w:tc>
-        <w:tc>
-          <w:tcPr>
-            <w:tcW w:type="dxa" w:w="2760"/>
-            <w:vAlign w:val="center"/>
-            <w:tcBorders>
-              <w:top w:val="single" w:sz="6" w:color="D9D9D9"/>
-              <w:left w:val="single" w:sz="6" w:color="D9D9D9"/>
-              <w:bottom w:val="single" w:sz="6" w:color="D9D9D9"/>
-              <w:right w:val="single" w:sz="6" w:color="D9D9D9"/>
-              <w:insideH w:val="single" w:sz="6" w:color="D9D9D9"/>
-              <w:insideV w:val="single" w:sz="6" w:color="D9D9D9"/>
-            </w:tcBorders>
-          </w:tcPr>
-          <w:p>
-            <w:pPr>
-              <w:spacing w:after="0" w:line="240" w:lineRule="auto"/>
-            </w:pPr>
-            <w:r>
-              <w:rPr>
-                <w:rFonts w:ascii="Arial" w:hAnsi="Arial" w:eastAsia="Arial"/>
-                <w:b w:val="0"/>
-                <w:color w:val="000000"/>
-                <w:sz w:val="17"/>
-              </w:rPr>
-              <w:t>含空标度</w:t>
+              <w:t>0.5500</w:t>
+            </w:r>
+          </w:p>
+        </w:tc>
+        <w:tc>
+          <w:tcPr>
+            <w:tcW w:type="dxa" w:w="2760"/>
+            <w:vAlign w:val="center"/>
+            <w:tcBorders>
+              <w:top w:val="single" w:sz="6" w:color="D9D9D9"/>
+              <w:left w:val="single" w:sz="6" w:color="D9D9D9"/>
+              <w:bottom w:val="single" w:sz="6" w:color="D9D9D9"/>
+              <w:right w:val="single" w:sz="6" w:color="D9D9D9"/>
+              <w:insideH w:val="single" w:sz="6" w:color="D9D9D9"/>
+              <w:insideV w:val="single" w:sz="6" w:color="D9D9D9"/>
+            </w:tcBorders>
+          </w:tcPr>
+          <w:p>
+            <w:pPr>
+              <w:spacing w:after="0" w:line="240" w:lineRule="auto"/>
+            </w:pPr>
+            <w:r>
+              <w:rPr>
+                <w:rFonts w:ascii="Arial" w:hAnsi="Arial" w:eastAsia="Arial"/>
+                <w:b w:val="0"/>
+                <w:color w:val="000000"/>
+                <w:sz w:val="17"/>
+              </w:rPr>
+              <w:t>轨道目标均为空，不代表掌握严重程度</w:t>
             </w:r>
           </w:p>
         </w:tc>
@@ -2038,7 +2052,7 @@
                 <w:color w:val="000000"/>
                 <w:sz w:val="17"/>
               </w:rPr>
-              <w:t>候选流程withdrawn; not included in result</w:t>
+              <w:t>实验候选未应用于正式结果</w:t>
             </w:r>
           </w:p>
         </w:tc>
@@ -2354,7 +2368,7 @@
                 <w:color w:val="000000"/>
                 <w:sz w:val="17"/>
               </w:rPr>
-              <w:t>共完成1274张测试图片</w:t>
+              <w:t>历史基线运行日志，不是本次实验耗时</w:t>
             </w:r>
           </w:p>
         </w:tc>

</xml_diff>